<commit_message>
Split the video script between four readers
One Word file per reader with their segments, timings, screen notes and
hand-over cues (the last words they hear before speaking and who speaks
next); the full script marks the reader of every segment. Reader 1 opens
and closes; word counts 207/183/184/174.

Co-Authored-By: Claude Opus 5.5 <noreply@anthropic.com>
Claude-Session: https://claude.ai/code/session_01QqiiXvinrJ56urYhvNQFPm
</commit_message>
<xml_diff>
--- a/docs/video_script_final.docx
+++ b/docs/video_script_final.docx
@@ -29,7 +29,7 @@
           <w:sz w:val="20"/>
           <w:szCs w:val="20"/>
         </w:rPr>
-        <w:t xml:space="preserve">约 748 个英文单词，按每分钟约 150 词念，约 5 分钟。录之前先计时念一遍。</w:t>
+        <w:t xml:space="preserve">约 748 个英文单词，按每分钟约 150 词念，约 5 分钟。四个人读，每段标题右边写着谁读。</w:t>
       </w:r>
     </w:p>
     <w:p>
@@ -63,6 +63,513 @@
         <w:t xml:space="preserve">超时的话：先把 S5c 换成下面给的短版，再删掉 S6g 里 "Our calendar predicts…" 那一句。</w:t>
       </w:r>
     </w:p>
+    <w:tbl>
+      <w:tblPr>
+        <w:tblW w:type="dxa" w:w="8700"/>
+        <w:tblBorders>
+          <w:top w:val="single" w:color="auto" w:sz="4"/>
+          <w:left w:val="single" w:color="auto" w:sz="4"/>
+          <w:bottom w:val="single" w:color="auto" w:sz="4"/>
+          <w:right w:val="single" w:color="auto" w:sz="4"/>
+          <w:insideH w:val="single" w:color="auto" w:sz="4"/>
+          <w:insideV w:val="single" w:color="auto" w:sz="4"/>
+        </w:tblBorders>
+      </w:tblPr>
+      <w:tblGrid>
+        <w:gridCol w:w="1100"/>
+        <w:gridCol w:w="2300"/>
+        <w:gridCol w:w="4100"/>
+        <w:gridCol w:w="1200"/>
+      </w:tblGrid>
+      <w:tr>
+        <w:tc>
+          <w:tcPr>
+            <w:tcW w:type="dxa" w:w="1100"/>
+            <w:shd w:fill="E8EEF5" w:color="auto" w:val="clear"/>
+            <w:tcMar>
+              <w:top w:type="dxa" w:w="60"/>
+              <w:left w:type="dxa" w:w="100"/>
+              <w:bottom w:type="dxa" w:w="60"/>
+              <w:right w:type="dxa" w:w="100"/>
+            </w:tcMar>
+          </w:tcPr>
+          <w:p>
+            <w:r>
+              <w:rPr>
+                <w:rFonts w:ascii="Calibri" w:cs="Calibri" w:eastAsia="Microsoft YaHei" w:hAnsi="Calibri"/>
+                <w:b/>
+                <w:bCs/>
+                <w:sz w:val="20"/>
+                <w:szCs w:val="20"/>
+              </w:rPr>
+              <w:t xml:space="preserve">读者</w:t>
+            </w:r>
+          </w:p>
+        </w:tc>
+        <w:tc>
+          <w:tcPr>
+            <w:tcW w:type="dxa" w:w="2300"/>
+            <w:shd w:fill="E8EEF5" w:color="auto" w:val="clear"/>
+            <w:tcMar>
+              <w:top w:type="dxa" w:w="60"/>
+              <w:left w:type="dxa" w:w="100"/>
+              <w:bottom w:type="dxa" w:w="60"/>
+              <w:right w:type="dxa" w:w="100"/>
+            </w:tcMar>
+          </w:tcPr>
+          <w:p>
+            <w:r>
+              <w:rPr>
+                <w:rFonts w:ascii="Calibri" w:cs="Calibri" w:eastAsia="Microsoft YaHei" w:hAnsi="Calibri"/>
+                <w:b/>
+                <w:bCs/>
+                <w:sz w:val="20"/>
+                <w:szCs w:val="20"/>
+              </w:rPr>
+              <w:t xml:space="preserve">段落</w:t>
+            </w:r>
+          </w:p>
+        </w:tc>
+        <w:tc>
+          <w:tcPr>
+            <w:tcW w:type="dxa" w:w="4100"/>
+            <w:shd w:fill="E8EEF5" w:color="auto" w:val="clear"/>
+            <w:tcMar>
+              <w:top w:type="dxa" w:w="60"/>
+              <w:left w:type="dxa" w:w="100"/>
+              <w:bottom w:type="dxa" w:w="60"/>
+              <w:right w:type="dxa" w:w="100"/>
+            </w:tcMar>
+          </w:tcPr>
+          <w:p>
+            <w:r>
+              <w:rPr>
+                <w:rFonts w:ascii="Calibri" w:cs="Calibri" w:eastAsia="Microsoft YaHei" w:hAnsi="Calibri"/>
+                <w:b/>
+                <w:bCs/>
+                <w:sz w:val="20"/>
+                <w:szCs w:val="20"/>
+              </w:rPr>
+              <w:t xml:space="preserve">内容</w:t>
+            </w:r>
+          </w:p>
+        </w:tc>
+        <w:tc>
+          <w:tcPr>
+            <w:tcW w:type="dxa" w:w="1200"/>
+            <w:shd w:fill="E8EEF5" w:color="auto" w:val="clear"/>
+            <w:tcMar>
+              <w:top w:type="dxa" w:w="60"/>
+              <w:left w:type="dxa" w:w="100"/>
+              <w:bottom w:type="dxa" w:w="60"/>
+              <w:right w:type="dxa" w:w="100"/>
+            </w:tcMar>
+          </w:tcPr>
+          <w:p>
+            <w:r>
+              <w:rPr>
+                <w:rFonts w:ascii="Calibri" w:cs="Calibri" w:eastAsia="Microsoft YaHei" w:hAnsi="Calibri"/>
+                <w:b/>
+                <w:bCs/>
+                <w:sz w:val="20"/>
+                <w:szCs w:val="20"/>
+              </w:rPr>
+              <w:t xml:space="preserve">词数 / 时长</w:t>
+            </w:r>
+          </w:p>
+        </w:tc>
+      </w:tr>
+      <w:tr>
+        <w:tc>
+          <w:tcPr>
+            <w:tcW w:type="dxa" w:w="1100"/>
+            <w:tcMar>
+              <w:top w:type="dxa" w:w="60"/>
+              <w:left w:type="dxa" w:w="100"/>
+              <w:bottom w:type="dxa" w:w="60"/>
+              <w:right w:type="dxa" w:w="100"/>
+            </w:tcMar>
+          </w:tcPr>
+          <w:p>
+            <w:r>
+              <w:rPr>
+                <w:rFonts w:ascii="Calibri" w:cs="Calibri" w:eastAsia="Microsoft YaHei" w:hAnsi="Calibri"/>
+                <w:b w:val="false"/>
+                <w:bCs w:val="false"/>
+                <w:sz w:val="20"/>
+                <w:szCs w:val="20"/>
+              </w:rPr>
+              <w:t xml:space="preserve">读者 1</w:t>
+            </w:r>
+          </w:p>
+        </w:tc>
+        <w:tc>
+          <w:tcPr>
+            <w:tcW w:type="dxa" w:w="2300"/>
+            <w:tcMar>
+              <w:top w:type="dxa" w:w="60"/>
+              <w:left w:type="dxa" w:w="100"/>
+              <w:bottom w:type="dxa" w:w="60"/>
+              <w:right w:type="dxa" w:w="100"/>
+            </w:tcMar>
+          </w:tcPr>
+          <w:p>
+            <w:r>
+              <w:rPr>
+                <w:rFonts w:ascii="Calibri" w:cs="Calibri" w:eastAsia="Microsoft YaHei" w:hAnsi="Calibri"/>
+                <w:b w:val="false"/>
+                <w:bCs w:val="false"/>
+                <w:sz w:val="20"/>
+                <w:szCs w:val="20"/>
+              </w:rPr>
+              <w:t xml:space="preserve">S1–S3，S7</w:t>
+            </w:r>
+          </w:p>
+        </w:tc>
+        <w:tc>
+          <w:tcPr>
+            <w:tcW w:type="dxa" w:w="4100"/>
+            <w:tcMar>
+              <w:top w:type="dxa" w:w="60"/>
+              <w:left w:type="dxa" w:w="100"/>
+              <w:bottom w:type="dxa" w:w="60"/>
+              <w:right w:type="dxa" w:w="100"/>
+            </w:tcMar>
+          </w:tcPr>
+          <w:p>
+            <w:r>
+              <w:rPr>
+                <w:rFonts w:ascii="Calibri" w:cs="Calibri" w:eastAsia="Microsoft YaHei" w:hAnsi="Calibri"/>
+                <w:b w:val="false"/>
+                <w:bCs w:val="false"/>
+                <w:sz w:val="20"/>
+                <w:szCs w:val="20"/>
+              </w:rPr>
+              <w:t xml:space="preserve">开场、空间天气、威胁，最后的建议</w:t>
+            </w:r>
+          </w:p>
+        </w:tc>
+        <w:tc>
+          <w:tcPr>
+            <w:tcW w:type="dxa" w:w="1200"/>
+            <w:tcMar>
+              <w:top w:type="dxa" w:w="60"/>
+              <w:left w:type="dxa" w:w="100"/>
+              <w:bottom w:type="dxa" w:w="60"/>
+              <w:right w:type="dxa" w:w="100"/>
+            </w:tcMar>
+          </w:tcPr>
+          <w:p>
+            <w:r>
+              <w:rPr>
+                <w:rFonts w:ascii="Calibri" w:cs="Calibri" w:eastAsia="Microsoft YaHei" w:hAnsi="Calibri"/>
+                <w:b w:val="false"/>
+                <w:bCs w:val="false"/>
+                <w:sz w:val="20"/>
+                <w:szCs w:val="20"/>
+              </w:rPr>
+              <w:t xml:space="preserve">207 / 约 1:23</w:t>
+            </w:r>
+          </w:p>
+        </w:tc>
+      </w:tr>
+      <w:tr>
+        <w:tc>
+          <w:tcPr>
+            <w:tcW w:type="dxa" w:w="1100"/>
+            <w:tcMar>
+              <w:top w:type="dxa" w:w="60"/>
+              <w:left w:type="dxa" w:w="100"/>
+              <w:bottom w:type="dxa" w:w="60"/>
+              <w:right w:type="dxa" w:w="100"/>
+            </w:tcMar>
+          </w:tcPr>
+          <w:p>
+            <w:r>
+              <w:rPr>
+                <w:rFonts w:ascii="Calibri" w:cs="Calibri" w:eastAsia="Microsoft YaHei" w:hAnsi="Calibri"/>
+                <w:b w:val="false"/>
+                <w:bCs w:val="false"/>
+                <w:sz w:val="20"/>
+                <w:szCs w:val="20"/>
+              </w:rPr>
+              <w:t xml:space="preserve">读者 2</w:t>
+            </w:r>
+          </w:p>
+        </w:tc>
+        <w:tc>
+          <w:tcPr>
+            <w:tcW w:type="dxa" w:w="2300"/>
+            <w:tcMar>
+              <w:top w:type="dxa" w:w="60"/>
+              <w:left w:type="dxa" w:w="100"/>
+              <w:bottom w:type="dxa" w:w="60"/>
+              <w:right w:type="dxa" w:w="100"/>
+            </w:tcMar>
+          </w:tcPr>
+          <w:p>
+            <w:r>
+              <w:rPr>
+                <w:rFonts w:ascii="Calibri" w:cs="Calibri" w:eastAsia="Microsoft YaHei" w:hAnsi="Calibri"/>
+                <w:b w:val="false"/>
+                <w:bCs w:val="false"/>
+                <w:sz w:val="20"/>
+                <w:szCs w:val="20"/>
+              </w:rPr>
+              <w:t xml:space="preserve">S4–S5c</w:t>
+            </w:r>
+          </w:p>
+        </w:tc>
+        <w:tc>
+          <w:tcPr>
+            <w:tcW w:type="dxa" w:w="4100"/>
+            <w:tcMar>
+              <w:top w:type="dxa" w:w="60"/>
+              <w:left w:type="dxa" w:w="100"/>
+              <w:bottom w:type="dxa" w:w="60"/>
+              <w:right w:type="dxa" w:w="100"/>
+            </w:tcMar>
+          </w:tcPr>
+          <w:p>
+            <w:r>
+              <w:rPr>
+                <w:rFonts w:ascii="Calibri" w:cs="Calibri" w:eastAsia="Microsoft YaHei" w:hAnsi="Calibri"/>
+                <w:b w:val="false"/>
+                <w:bCs w:val="false"/>
+                <w:sz w:val="20"/>
+                <w:szCs w:val="20"/>
+              </w:rPr>
+              <w:t xml:space="preserve">利害，手动测量和推导方程（最好是录屏里量黑子的那位）</w:t>
+            </w:r>
+          </w:p>
+        </w:tc>
+        <w:tc>
+          <w:tcPr>
+            <w:tcW w:type="dxa" w:w="1200"/>
+            <w:tcMar>
+              <w:top w:type="dxa" w:w="60"/>
+              <w:left w:type="dxa" w:w="100"/>
+              <w:bottom w:type="dxa" w:w="60"/>
+              <w:right w:type="dxa" w:w="100"/>
+            </w:tcMar>
+          </w:tcPr>
+          <w:p>
+            <w:r>
+              <w:rPr>
+                <w:rFonts w:ascii="Calibri" w:cs="Calibri" w:eastAsia="Microsoft YaHei" w:hAnsi="Calibri"/>
+                <w:b w:val="false"/>
+                <w:bCs w:val="false"/>
+                <w:sz w:val="20"/>
+                <w:szCs w:val="20"/>
+              </w:rPr>
+              <w:t xml:space="preserve">183 / 约 1:13</w:t>
+            </w:r>
+          </w:p>
+        </w:tc>
+      </w:tr>
+      <w:tr>
+        <w:tc>
+          <w:tcPr>
+            <w:tcW w:type="dxa" w:w="1100"/>
+            <w:tcMar>
+              <w:top w:type="dxa" w:w="60"/>
+              <w:left w:type="dxa" w:w="100"/>
+              <w:bottom w:type="dxa" w:w="60"/>
+              <w:right w:type="dxa" w:w="100"/>
+            </w:tcMar>
+          </w:tcPr>
+          <w:p>
+            <w:r>
+              <w:rPr>
+                <w:rFonts w:ascii="Calibri" w:cs="Calibri" w:eastAsia="Microsoft YaHei" w:hAnsi="Calibri"/>
+                <w:b w:val="false"/>
+                <w:bCs w:val="false"/>
+                <w:sz w:val="20"/>
+                <w:szCs w:val="20"/>
+              </w:rPr>
+              <w:t xml:space="preserve">读者 3</w:t>
+            </w:r>
+          </w:p>
+        </w:tc>
+        <w:tc>
+          <w:tcPr>
+            <w:tcW w:type="dxa" w:w="2300"/>
+            <w:tcMar>
+              <w:top w:type="dxa" w:w="60"/>
+              <w:left w:type="dxa" w:w="100"/>
+              <w:bottom w:type="dxa" w:w="60"/>
+              <w:right w:type="dxa" w:w="100"/>
+            </w:tcMar>
+          </w:tcPr>
+          <w:p>
+            <w:r>
+              <w:rPr>
+                <w:rFonts w:ascii="Calibri" w:cs="Calibri" w:eastAsia="Microsoft YaHei" w:hAnsi="Calibri"/>
+                <w:b w:val="false"/>
+                <w:bCs w:val="false"/>
+                <w:sz w:val="20"/>
+                <w:szCs w:val="20"/>
+              </w:rPr>
+              <w:t xml:space="preserve">S5d–S6c</w:t>
+            </w:r>
+          </w:p>
+        </w:tc>
+        <w:tc>
+          <w:tcPr>
+            <w:tcW w:type="dxa" w:w="4100"/>
+            <w:tcMar>
+              <w:top w:type="dxa" w:w="60"/>
+              <w:left w:type="dxa" w:w="100"/>
+              <w:bottom w:type="dxa" w:w="60"/>
+              <w:right w:type="dxa" w:w="100"/>
+            </w:tcMar>
+          </w:tcPr>
+          <w:p>
+            <w:r>
+              <w:rPr>
+                <w:rFonts w:ascii="Calibri" w:cs="Calibri" w:eastAsia="Microsoft YaHei" w:hAnsi="Calibri"/>
+                <w:b w:val="false"/>
+                <w:bCs w:val="false"/>
+                <w:sz w:val="20"/>
+                <w:szCs w:val="20"/>
+              </w:rPr>
+              <w:t xml:space="preserve">蝴蝶图、预测，粒子防御的第一、二层</w:t>
+            </w:r>
+          </w:p>
+        </w:tc>
+        <w:tc>
+          <w:tcPr>
+            <w:tcW w:type="dxa" w:w="1200"/>
+            <w:tcMar>
+              <w:top w:type="dxa" w:w="60"/>
+              <w:left w:type="dxa" w:w="100"/>
+              <w:bottom w:type="dxa" w:w="60"/>
+              <w:right w:type="dxa" w:w="100"/>
+            </w:tcMar>
+          </w:tcPr>
+          <w:p>
+            <w:r>
+              <w:rPr>
+                <w:rFonts w:ascii="Calibri" w:cs="Calibri" w:eastAsia="Microsoft YaHei" w:hAnsi="Calibri"/>
+                <w:b w:val="false"/>
+                <w:bCs w:val="false"/>
+                <w:sz w:val="20"/>
+                <w:szCs w:val="20"/>
+              </w:rPr>
+              <w:t xml:space="preserve">184 / 约 1:14</w:t>
+            </w:r>
+          </w:p>
+        </w:tc>
+      </w:tr>
+      <w:tr>
+        <w:tc>
+          <w:tcPr>
+            <w:tcW w:type="dxa" w:w="1100"/>
+            <w:tcMar>
+              <w:top w:type="dxa" w:w="60"/>
+              <w:left w:type="dxa" w:w="100"/>
+              <w:bottom w:type="dxa" w:w="60"/>
+              <w:right w:type="dxa" w:w="100"/>
+            </w:tcMar>
+          </w:tcPr>
+          <w:p>
+            <w:r>
+              <w:rPr>
+                <w:rFonts w:ascii="Calibri" w:cs="Calibri" w:eastAsia="Microsoft YaHei" w:hAnsi="Calibri"/>
+                <w:b w:val="false"/>
+                <w:bCs w:val="false"/>
+                <w:sz w:val="20"/>
+                <w:szCs w:val="20"/>
+              </w:rPr>
+              <w:t xml:space="preserve">读者 4</w:t>
+            </w:r>
+          </w:p>
+        </w:tc>
+        <w:tc>
+          <w:tcPr>
+            <w:tcW w:type="dxa" w:w="2300"/>
+            <w:tcMar>
+              <w:top w:type="dxa" w:w="60"/>
+              <w:left w:type="dxa" w:w="100"/>
+              <w:bottom w:type="dxa" w:w="60"/>
+              <w:right w:type="dxa" w:w="100"/>
+            </w:tcMar>
+          </w:tcPr>
+          <w:p>
+            <w:r>
+              <w:rPr>
+                <w:rFonts w:ascii="Calibri" w:cs="Calibri" w:eastAsia="Microsoft YaHei" w:hAnsi="Calibri"/>
+                <w:b w:val="false"/>
+                <w:bCs w:val="false"/>
+                <w:sz w:val="20"/>
+                <w:szCs w:val="20"/>
+              </w:rPr>
+              <w:t xml:space="preserve">S6d–S6g</w:t>
+            </w:r>
+          </w:p>
+        </w:tc>
+        <w:tc>
+          <w:tcPr>
+            <w:tcW w:type="dxa" w:w="4100"/>
+            <w:tcMar>
+              <w:top w:type="dxa" w:w="60"/>
+              <w:left w:type="dxa" w:w="100"/>
+              <w:bottom w:type="dxa" w:w="60"/>
+              <w:right w:type="dxa" w:w="100"/>
+            </w:tcMar>
+          </w:tcPr>
+          <w:p>
+            <w:r>
+              <w:rPr>
+                <w:rFonts w:ascii="Calibri" w:cs="Calibri" w:eastAsia="Microsoft YaHei" w:hAnsi="Calibri"/>
+                <w:b w:val="false"/>
+                <w:bCs w:val="false"/>
+                <w:sz w:val="20"/>
+                <w:szCs w:val="20"/>
+              </w:rPr>
+              <w:t xml:space="preserve">被动屏蔽、阻力、成本、方案的局限</w:t>
+            </w:r>
+          </w:p>
+        </w:tc>
+        <w:tc>
+          <w:tcPr>
+            <w:tcW w:type="dxa" w:w="1200"/>
+            <w:tcMar>
+              <w:top w:type="dxa" w:w="60"/>
+              <w:left w:type="dxa" w:w="100"/>
+              <w:bottom w:type="dxa" w:w="60"/>
+              <w:right w:type="dxa" w:w="100"/>
+            </w:tcMar>
+          </w:tcPr>
+          <w:p>
+            <w:r>
+              <w:rPr>
+                <w:rFonts w:ascii="Calibri" w:cs="Calibri" w:eastAsia="Microsoft YaHei" w:hAnsi="Calibri"/>
+                <w:b w:val="false"/>
+                <w:bCs w:val="false"/>
+                <w:sz w:val="20"/>
+                <w:szCs w:val="20"/>
+              </w:rPr>
+              <w:t xml:space="preserve">174 / 约 1:10</w:t>
+            </w:r>
+          </w:p>
+        </w:tc>
+      </w:tr>
+    </w:tbl>
+    <w:p>
+      <w:pPr>
+        <w:spacing w:after="120" w:before="120"/>
+      </w:pPr>
+      <w:r>
+        <w:rPr>
+          <w:rFonts w:ascii="Calibri" w:cs="Calibri" w:eastAsia="Microsoft YaHei" w:hAnsi="Calibri"/>
+          <w:color w:val="666666"/>
+          <w:sz w:val="20"/>
+          <w:szCs w:val="20"/>
+        </w:rPr>
+        <w:t xml:space="preserve">全片顺序：读者 1（S1–S3）→ 读者 2（S4–S5c）→ 读者 3（S5d–S6c）→ 读者 4（S6d–S6g）→ 读者 1（S7）</w:t>
+      </w:r>
+    </w:p>
     <w:p>
       <w:pPr>
         <w:pStyle w:val="Heading2"/>
@@ -88,6 +595,17 @@
         </w:rPr>
         <w:t xml:space="preserve">    0:00–0:20</w:t>
       </w:r>
+      <w:r>
+        <w:rPr>
+          <w:rFonts w:ascii="Calibri" w:cs="Calibri" w:eastAsia="Microsoft YaHei" w:hAnsi="Calibri"/>
+          <w:b/>
+          <w:bCs/>
+          <w:color w:val="1F5C99"/>
+          <w:sz w:val="22"/>
+          <w:szCs w:val="22"/>
+        </w:rPr>
+        <w:t xml:space="preserve">    读者 1</w:t>
+      </w:r>
     </w:p>
     <w:p>
       <w:pPr>
@@ -152,6 +670,17 @@
         </w:rPr>
         <w:t xml:space="preserve">    0:20–0:42</w:t>
       </w:r>
+      <w:r>
+        <w:rPr>
+          <w:rFonts w:ascii="Calibri" w:cs="Calibri" w:eastAsia="Microsoft YaHei" w:hAnsi="Calibri"/>
+          <w:b/>
+          <w:bCs/>
+          <w:color w:val="1F5C99"/>
+          <w:sz w:val="22"/>
+          <w:szCs w:val="22"/>
+        </w:rPr>
+        <w:t xml:space="preserve">    读者 1</w:t>
+      </w:r>
     </w:p>
     <w:p>
       <w:pPr>
@@ -216,6 +745,17 @@
         </w:rPr>
         <w:t xml:space="preserve">    0:42–1:07</w:t>
       </w:r>
+      <w:r>
+        <w:rPr>
+          <w:rFonts w:ascii="Calibri" w:cs="Calibri" w:eastAsia="Microsoft YaHei" w:hAnsi="Calibri"/>
+          <w:b/>
+          <w:bCs/>
+          <w:color w:val="1F5C99"/>
+          <w:sz w:val="22"/>
+          <w:szCs w:val="22"/>
+        </w:rPr>
+        <w:t xml:space="preserve">    读者 1</w:t>
+      </w:r>
     </w:p>
     <w:p>
       <w:pPr>
@@ -280,6 +820,17 @@
         </w:rPr>
         <w:t xml:space="preserve">    1:07–1:21</w:t>
       </w:r>
+      <w:r>
+        <w:rPr>
+          <w:rFonts w:ascii="Calibri" w:cs="Calibri" w:eastAsia="Microsoft YaHei" w:hAnsi="Calibri"/>
+          <w:b/>
+          <w:bCs/>
+          <w:color w:val="1F5C99"/>
+          <w:sz w:val="22"/>
+          <w:szCs w:val="22"/>
+        </w:rPr>
+        <w:t xml:space="preserve">    读者 2</w:t>
+      </w:r>
     </w:p>
     <w:p>
       <w:pPr>
@@ -344,6 +895,17 @@
         </w:rPr>
         <w:t xml:space="preserve">    1:21–1:46</w:t>
       </w:r>
+      <w:r>
+        <w:rPr>
+          <w:rFonts w:ascii="Calibri" w:cs="Calibri" w:eastAsia="Microsoft YaHei" w:hAnsi="Calibri"/>
+          <w:b/>
+          <w:bCs/>
+          <w:color w:val="1F5C99"/>
+          <w:sz w:val="22"/>
+          <w:szCs w:val="22"/>
+        </w:rPr>
+        <w:t xml:space="preserve">    读者 2</w:t>
+      </w:r>
     </w:p>
     <w:p>
       <w:pPr>
@@ -408,6 +970,17 @@
         </w:rPr>
         <w:t xml:space="preserve">    1:46–2:07</w:t>
       </w:r>
+      <w:r>
+        <w:rPr>
+          <w:rFonts w:ascii="Calibri" w:cs="Calibri" w:eastAsia="Microsoft YaHei" w:hAnsi="Calibri"/>
+          <w:b/>
+          <w:bCs/>
+          <w:color w:val="1F5C99"/>
+          <w:sz w:val="22"/>
+          <w:szCs w:val="22"/>
+        </w:rPr>
+        <w:t xml:space="preserve">    读者 2</w:t>
+      </w:r>
     </w:p>
     <w:p>
       <w:pPr>
@@ -472,6 +1045,17 @@
         </w:rPr>
         <w:t xml:space="preserve">    2:07–2:20</w:t>
       </w:r>
+      <w:r>
+        <w:rPr>
+          <w:rFonts w:ascii="Calibri" w:cs="Calibri" w:eastAsia="Microsoft YaHei" w:hAnsi="Calibri"/>
+          <w:b/>
+          <w:bCs/>
+          <w:color w:val="1F5C99"/>
+          <w:sz w:val="22"/>
+          <w:szCs w:val="22"/>
+        </w:rPr>
+        <w:t xml:space="preserve">    读者 2</w:t>
+      </w:r>
     </w:p>
     <w:p>
       <w:pPr>
@@ -488,25 +1072,32 @@
     </w:p>
     <w:p>
       <w:pPr>
-        <w:spacing w:after="80"/>
-      </w:pPr>
-      <w:r>
-        <w:rPr>
-          <w:rFonts w:ascii="Calibri" w:cs="Calibri" w:eastAsia="Microsoft YaHei" w:hAnsi="Calibri"/>
-          <w:color w:val="666666"/>
-          <w:sz w:val="20"/>
-          <w:szCs w:val="20"/>
+        <w:spacing w:after="60"/>
+      </w:pPr>
+      <w:r>
+        <w:rPr>
+          <w:rFonts w:ascii="Calibri" w:cs="Calibri" w:eastAsia="Microsoft YaHei" w:hAnsi="Calibri"/>
+          <w:i w:val="false"/>
+          <w:iCs w:val="false"/>
+          <w:color w:val="666666"/>
+          <w:sz w:val="19"/>
+          <w:szCs w:val="19"/>
         </w:rPr>
         <w:t xml:space="preserve">短版（不讲两个黑子的推导）：</w:t>
       </w:r>
+    </w:p>
+    <w:p>
+      <w:pPr>
+        <w:spacing w:after="60"/>
+      </w:pPr>
       <w:r>
         <w:rPr>
           <w:rFonts w:ascii="Calibri" w:cs="Calibri" w:eastAsia="Microsoft YaHei" w:hAnsi="Calibri"/>
           <w:i/>
           <w:iCs/>
           <w:color w:val="666666"/>
-          <w:sz w:val="20"/>
-          <w:szCs w:val="20"/>
+          <w:sz w:val="19"/>
+          <w:szCs w:val="19"/>
         </w:rPr>
         <w:t xml:space="preserve">With 21,566 sunspot groups from 150 years of records, the rates fall on a straight line: omega equals 14.54 minus 2.84 sin squared latitude, in degrees per day.</w:t>
       </w:r>
@@ -561,6 +1152,17 @@
         </w:rPr>
         <w:t xml:space="preserve">    2:20–2:34</w:t>
       </w:r>
+      <w:r>
+        <w:rPr>
+          <w:rFonts w:ascii="Calibri" w:cs="Calibri" w:eastAsia="Microsoft YaHei" w:hAnsi="Calibri"/>
+          <w:b/>
+          <w:bCs/>
+          <w:color w:val="1F5C99"/>
+          <w:sz w:val="22"/>
+          <w:szCs w:val="22"/>
+        </w:rPr>
+        <w:t xml:space="preserve">    读者 3</w:t>
+      </w:r>
     </w:p>
     <w:p>
       <w:pPr>
@@ -624,6 +1226,17 @@
           <w:szCs w:val="22"/>
         </w:rPr>
         <w:t xml:space="preserve">    2:34–2:52</w:t>
+      </w:r>
+      <w:r>
+        <w:rPr>
+          <w:rFonts w:ascii="Calibri" w:cs="Calibri" w:eastAsia="Microsoft YaHei" w:hAnsi="Calibri"/>
+          <w:b/>
+          <w:bCs/>
+          <w:color w:val="1F5C99"/>
+          <w:sz w:val="22"/>
+          <w:szCs w:val="22"/>
+        </w:rPr>
+        <w:t xml:space="preserve">    读者 3</w:t>
       </w:r>
     </w:p>
     <w:p>
@@ -707,6 +1320,17 @@
         </w:rPr>
         <w:t xml:space="preserve">    2:52–3:02</w:t>
       </w:r>
+      <w:r>
+        <w:rPr>
+          <w:rFonts w:ascii="Calibri" w:cs="Calibri" w:eastAsia="Microsoft YaHei" w:hAnsi="Calibri"/>
+          <w:b/>
+          <w:bCs/>
+          <w:color w:val="1F5C99"/>
+          <w:sz w:val="22"/>
+          <w:szCs w:val="22"/>
+        </w:rPr>
+        <w:t xml:space="preserve">    读者 3</w:t>
+      </w:r>
     </w:p>
     <w:p>
       <w:pPr>
@@ -771,6 +1395,17 @@
         </w:rPr>
         <w:t xml:space="preserve">    3:02–3:21</w:t>
       </w:r>
+      <w:r>
+        <w:rPr>
+          <w:rFonts w:ascii="Calibri" w:cs="Calibri" w:eastAsia="Microsoft YaHei" w:hAnsi="Calibri"/>
+          <w:b/>
+          <w:bCs/>
+          <w:color w:val="1F5C99"/>
+          <w:sz w:val="22"/>
+          <w:szCs w:val="22"/>
+        </w:rPr>
+        <w:t xml:space="preserve">    读者 3</w:t>
+      </w:r>
     </w:p>
     <w:p>
       <w:pPr>
@@ -835,6 +1470,17 @@
         </w:rPr>
         <w:t xml:space="preserve">    3:21–3:34</w:t>
       </w:r>
+      <w:r>
+        <w:rPr>
+          <w:rFonts w:ascii="Calibri" w:cs="Calibri" w:eastAsia="Microsoft YaHei" w:hAnsi="Calibri"/>
+          <w:b/>
+          <w:bCs/>
+          <w:color w:val="1F5C99"/>
+          <w:sz w:val="22"/>
+          <w:szCs w:val="22"/>
+        </w:rPr>
+        <w:t xml:space="preserve">    读者 3</w:t>
+      </w:r>
     </w:p>
     <w:p>
       <w:pPr>
@@ -899,6 +1545,17 @@
         </w:rPr>
         <w:t xml:space="preserve">    3:34–4:01</w:t>
       </w:r>
+      <w:r>
+        <w:rPr>
+          <w:rFonts w:ascii="Calibri" w:cs="Calibri" w:eastAsia="Microsoft YaHei" w:hAnsi="Calibri"/>
+          <w:b/>
+          <w:bCs/>
+          <w:color w:val="1F5C99"/>
+          <w:sz w:val="22"/>
+          <w:szCs w:val="22"/>
+        </w:rPr>
+        <w:t xml:space="preserve">    读者 4</w:t>
+      </w:r>
     </w:p>
     <w:p>
       <w:pPr>
@@ -963,6 +1620,17 @@
         </w:rPr>
         <w:t xml:space="preserve">    4:01–4:13</w:t>
       </w:r>
+      <w:r>
+        <w:rPr>
+          <w:rFonts w:ascii="Calibri" w:cs="Calibri" w:eastAsia="Microsoft YaHei" w:hAnsi="Calibri"/>
+          <w:b/>
+          <w:bCs/>
+          <w:color w:val="1F5C99"/>
+          <w:sz w:val="22"/>
+          <w:szCs w:val="22"/>
+        </w:rPr>
+        <w:t xml:space="preserve">    读者 4</w:t>
+      </w:r>
     </w:p>
     <w:p>
       <w:pPr>
@@ -1027,6 +1695,17 @@
         </w:rPr>
         <w:t xml:space="preserve">    4:13–4:24</w:t>
       </w:r>
+      <w:r>
+        <w:rPr>
+          <w:rFonts w:ascii="Calibri" w:cs="Calibri" w:eastAsia="Microsoft YaHei" w:hAnsi="Calibri"/>
+          <w:b/>
+          <w:bCs/>
+          <w:color w:val="1F5C99"/>
+          <w:sz w:val="22"/>
+          <w:szCs w:val="22"/>
+        </w:rPr>
+        <w:t xml:space="preserve">    读者 4</w:t>
+      </w:r>
     </w:p>
     <w:p>
       <w:pPr>
@@ -1090,6 +1769,17 @@
           <w:szCs w:val="22"/>
         </w:rPr>
         <w:t xml:space="preserve">    4:24–4:44</w:t>
+      </w:r>
+      <w:r>
+        <w:rPr>
+          <w:rFonts w:ascii="Calibri" w:cs="Calibri" w:eastAsia="Microsoft YaHei" w:hAnsi="Calibri"/>
+          <w:b/>
+          <w:bCs/>
+          <w:color w:val="1F5C99"/>
+          <w:sz w:val="22"/>
+          <w:szCs w:val="22"/>
+        </w:rPr>
+        <w:t xml:space="preserve">    读者 4</w:t>
       </w:r>
     </w:p>
     <w:p>
@@ -1156,6 +1846,17 @@
           <w:szCs w:val="22"/>
         </w:rPr>
         <w:t xml:space="preserve">    4:44–5:00</w:t>
+      </w:r>
+      <w:r>
+        <w:rPr>
+          <w:rFonts w:ascii="Calibri" w:cs="Calibri" w:eastAsia="Microsoft YaHei" w:hAnsi="Calibri"/>
+          <w:b/>
+          <w:bCs/>
+          <w:color w:val="1F5C99"/>
+          <w:sz w:val="22"/>
+          <w:szCs w:val="22"/>
+        </w:rPr>
+        <w:t xml:space="preserve">    读者 1</w:t>
       </w:r>
     </w:p>
     <w:p>

</xml_diff>

<commit_message>
Video asset list: what to show for each line, with sources and credits
docs/video_assets.docx maps every part of the script to our figures, our
own recordings and props, or real NASA/SOHO/NOAA footage (SVS 3956, 14593,
20192; ESA SOHO proton snow; GOES proton flux; Helioviewer), with download
links, credit lines and the end-card credits. Screen notes in the script
files updated to match.

Co-Authored-By: Claude Opus 5.5 <noreply@anthropic.com>
Claude-Session: https://claude.ai/code/session_01QqiiXvinrJ56urYhvNQFPm
</commit_message>
<xml_diff>
--- a/docs/video_script_final.docx
+++ b/docs/video_script_final.docx
@@ -642,7 +642,7 @@
           <w:sz w:val="19"/>
           <w:szCs w:val="19"/>
         </w:rPr>
-        <w:t xml:space="preserve">真实的 SDO 太阳图像全屏，慢慢放大；叠字 "Halloween 2003: 3,000× NOAA's alert level"，再换成 "February 2022: 38 Starlink satellites lost"。</w:t>
+        <w:t xml:space="preserve">SVS 3956 片段：2003 年 10 月 28–29 日 SOHO 相机被质子"雪花"盖满，叠字 "Halloween 2003: 3,000× NOAA's alert level" → Starlink 照片或纯色底，叠字 "February 2022: 38 Starlink satellites lost" → 真实 SDO 太阳全图慢慢放大。</w:t>
       </w:r>
     </w:p>
     <w:p>
@@ -717,7 +717,7 @@
           <w:sz w:val="19"/>
           <w:szCs w:val="19"/>
         </w:rPr>
-        <w:t xml:space="preserve">sdo_daily_strip.png（黑子 7 天里从左往右移动）→ flares_vs_sunspots.png。</w:t>
+        <w:t xml:space="preserve">sdo_daily_strip.png（我们的 SDO 图像）→ flares_vs_sunspots.png → SVS 14593 的 X8.7 耀斑 3 秒 → SOHO 质子"雪花" 2 秒 → SVS 20192 日冕物质抛射压缩磁层（标 "NASA animation"）。</w:t>
       </w:r>
     </w:p>
     <w:p>
@@ -792,7 +792,7 @@
           <w:sz w:val="19"/>
           <w:szCs w:val="19"/>
         </w:rPr>
-        <w:t xml:space="preserve">protons.png 左图（每年的质子事件）→ drag_leo.png 左图（空气密度）。</w:t>
+        <w:t xml:space="preserve">SOHO 质子"雪花"静图放大（每个白点是一个打在相机上的质子）→ protons.png 左图 → drag_leo.png 左图。</w:t>
       </w:r>
     </w:p>
     <w:p>
@@ -1442,7 +1442,7 @@
           <w:sz w:val="19"/>
           <w:szCs w:val="19"/>
         </w:rPr>
-        <w:t xml:space="preserve">region_calendar.png；讲到 GOES 时闪一下 response_playbook.png 的 Warning 和 Alert 两行。</w:t>
+        <w:t xml:space="preserve">NOAA SWPC 的 GOES 质子通量页面截图 → Helioviewer 做的 2024 年 4 月底到 5 月中 SDO 动画（AR 13664 转过日面）→ region_calendar.png。</w:t>
       </w:r>
     </w:p>
     <w:p>
@@ -1592,7 +1592,7 @@
           <w:sz w:val="19"/>
           <w:szCs w:val="19"/>
         </w:rPr>
-        <w:t xml:space="preserve">shielding.png 中图（地球磁场挡掉多少）→ 右图（星星是我们的保险箱）。</w:t>
+        <w:t xml:space="preserve">shielding.png 中图（地球磁场挡掉多少）→ 道具：3–4 mm 铝板叠上约 8 mm 的聚乙烯砧板、30×30×15 cm 的纸箱模型 → shielding.png 右图（星星是我们的保险箱）。</w:t>
       </w:r>
     </w:p>
     <w:p>
@@ -1667,7 +1667,7 @@
           <w:sz w:val="19"/>
           <w:szCs w:val="19"/>
         </w:rPr>
-        <w:t xml:space="preserve">drag_leo.png 中图（从多高出发能撑多少天）。</w:t>
+        <w:t xml:space="preserve">SOHO 日冕仪拍到的日冕物质抛射（SVS 3956 或 Helioviewer 的 LASCO C3）→ drag_leo.png 中图。</w:t>
       </w:r>
     </w:p>
     <w:p>

</xml_diff>